<commit_message>
Group area onset-PSTH probe maps with the aperiodic analysis.
The Figure 2 area-map script draws the play-bout onset PSTH for each area and probe. List it with the FOOOF onset figures under the same reviewer request.

Co-authored-by: Miguel Concha Miranda <miguelconcham@users.noreply.github.com>
</commit_message>
<xml_diff>
--- a/Revision-figure-scripts.docx
+++ b/Revision-figure-scripts.docx
@@ -61,7 +61,49 @@
           <w:rFonts w:ascii="Calibri" w:hAnsi="Calibri"/>
           <w:sz w:val="26"/>
         </w:rPr>
-        <w:t>1.1 Aperiodic-corrected spectra at play onset (Reviewer 2.3)</w:t>
+        <w:t>1.1 Probe maps of the onset PSTH, together with the aperiodic analysis (Reviewer 2.3)</w:t>
+      </w:r>
+    </w:p>
+    <w:p>
+      <w:pPr/>
+      <w:r>
+        <w:t>These scripts answer the request to draw the probe maps together with the aperiodic analysis.</w:t>
+      </w:r>
+    </w:p>
+    <w:p>
+      <w:pPr/>
+      <w:r>
+        <w:t>Probe maps, onset PSTH for each area. Figure script: Figure 2/Supporting codes v2/Analyze_psth_area_maps.m. Each row is one animal and probe.</w:t>
+      </w:r>
+    </w:p>
+    <w:p>
+      <w:pPr>
+        <w:pStyle w:val="ListBullet"/>
+      </w:pPr>
+      <w:r>
+        <w:t>Section “Plot 1 — compare area PSTHs (LPAG vs VLPAG) with LME”.</w:t>
+      </w:r>
+    </w:p>
+    <w:p>
+      <w:pPr>
+        <w:pStyle w:val="ListBullet"/>
+      </w:pPr>
+      <w:r>
+        <w:t>Section “Plot 2 — power-spectrum percentile maps by area”. Areas are SupCol, DLPAG, LPAG, VLPAG, and DR.</w:t>
+      </w:r>
+    </w:p>
+    <w:p>
+      <w:pPr>
+        <w:pStyle w:val="ListBullet"/>
+      </w:pPr>
+      <w:r>
+        <w:t>Section “Plot 3 — LPAG detail (PSTH + power spectrum, 4-panel)”. Onset heatmap, mean with confidence interval, power-percentile map, and spectrum.</w:t>
+      </w:r>
+    </w:p>
+    <w:p>
+      <w:pPr/>
+      <w:r>
+        <w:t>Run Figure 2/Supporting codes v2/Estimate_psth_area_maps.m before that figure. It calls GENERATE_PSTH_AREA_MAPS.m and builds the per-channel play_bout_onset maps.</w:t>
       </w:r>
     </w:p>
     <w:p>
@@ -74,7 +116,7 @@
           <w:b w:val="0"/>
           <w:sz w:val="22"/>
         </w:rPr>
-        <w:t>Figure script: Figure 2/Supporting codes v2/Analyze_psth_full_spectrogram_fooof.m</w:t>
+        <w:t>Aperiodic analysis at the same play onset. Figure script: Figure 2/Supporting codes v2/Analyze_psth_full_spectrogram_fooof.m</w:t>
       </w:r>
     </w:p>
     <w:p>
@@ -170,7 +212,7 @@
           <w:rFonts w:ascii="Calibri" w:hAnsi="Calibri"/>
           <w:sz w:val="26"/>
         </w:rPr>
-        <w:t>1.2 Sliding-window FOOOF along the onset spectrogram (Reviewer 2.3)</w:t>
+        <w:t>1.2 Sliding-window aperiodic analysis of the same onset (Reviewer 2.3)</w:t>
       </w:r>
     </w:p>
     <w:p>
@@ -183,7 +225,7 @@
           <w:b w:val="0"/>
           <w:sz w:val="22"/>
         </w:rPr>
-        <w:t>Figure script: Figure 2/Supporting codes v2/Analyze_psth_full_spectrogram_fooof_sliding.m</w:t>
+        <w:t>Time-resolved part of the same probe-map and aperiodic request (task 1.1). Figure script: Figure 2/Supporting codes v2/Analyze_psth_full_spectrogram_fooof_sliding.m</w:t>
       </w:r>
     </w:p>
     <w:p>
@@ -1434,7 +1476,7 @@
           <w:b w:val="0"/>
           <w:sz w:val="22"/>
         </w:rPr>
-        <w:t>Figure 2/Supporting codes v2/Analyze_psth_area_maps.m. “Plot 1 — compare area PSTHs”, “Plot 2 — power-spectrum percentile maps by area”, “Plot 3 — LPAG detail”.</w:t>
+        <w:t>Per-area onset PSTHs and power maps are in task 1.1: Figure 2/Supporting codes v2/Analyze_psth_area_maps.m.</w:t>
       </w:r>
     </w:p>
     <w:p>

</xml_diff>

<commit_message>
Update the revision figure list through 28 October.
Record the new delta phase-distance plots, probe spectra, speed peak-frequency figures, delta episodes, animal-pooled CSD, and the pounce band-power classifier. Leave sex, the sample table, the 1 s pre-onset window, local re-reference, partner order, distance matching, and the original pooled neuron tests open.

Co-authored-by: Miguel Concha Miranda <miguelconcham@users.noreply.github.com>
</commit_message>
<xml_diff>
--- a/Revision-figure-scripts.docx
+++ b/Revision-figure-scripts.docx
@@ -20,7 +20,7 @@
           <w:b w:val="0"/>
           <w:sz w:val="22"/>
         </w:rPr>
-        <w:t>Repository play-bout-analysis-behavior-and-physiology, origin/main at 677d766 (21 October 2026). Each task lists the scripts that draw the figures for that point. Estimate and GENERATE scripts are named only when you have to run them before the figure script. A blank list means there is no figure script for that point yet.</w:t>
+        <w:t>Repository play-bout-analysis-behavior-and-physiology, origin/main at bc6ce67 (28 October 2026). Each task lists the scripts that draw the figures for that point. Estimate and GENERATE scripts are named only when you have to run them before the figure script. A blank list means there is no figure script for that point yet.</w:t>
       </w:r>
     </w:p>
     <w:p>
@@ -33,7 +33,7 @@
           <w:b/>
           <w:sz w:val="22"/>
         </w:rPr>
-        <w:t xml:space="preserve">Phase-lag plots. </w:t>
+        <w:t>Phase-lag plots. Delta phase versus distance from the mid-LPAG channel is drawn in Figure 2/Supporting codes v2/Analyze_coherence_maps.m. Plot 1 is every session as one line. Plot 2 is one figure per animal, with region borders. Probes without DR or OcNuc, and probes that have them, are separate scatters with a session-interpolated 95% confidence interval. The y-axis is the delta phase lag, mean_phaseLag_freq1 (1–5 Hz). Analyze_coherence_maps_lpag_ref.m draws the same curves from the faster mid-LPAG-only estimate. Estimate_coherence_maps.m now only builds the pairwise matrices. These plots are task 1.13.</w:t>
       </w:r>
       <w:r>
         <w:rPr>
@@ -41,7 +41,6 @@
           <w:b w:val="0"/>
           <w:sz w:val="22"/>
         </w:rPr>
-        <w:t>These are drawn in Figure 2/Supporting codes v2/Estimate_coherence_maps.m, section “Plot — phase lags”. The loop plots pli_struct.mean_phaseLag_freq2, channels ordered by depth, one panel per recording. In that same file, freq_range_2 is 6–12 Hz and freq_range_1 is 1–5 Hz, so the figure as written is the second band. Delta phase lag is the field mean_phaseLag_freq1, which this loop does not plot. These plots are listed under the dorsoventral phase and volume-conduction task.</w:t>
       </w:r>
     </w:p>
     <w:p>
@@ -204,6 +203,12 @@
       </w:r>
     </w:p>
     <w:p>
+      <w:pPr/>
+      <w:r>
+        <w:t>Channel-wise aperiodic spectra along the whole probe, stacked on mid-LPAG, are task 1.14.</w:t>
+      </w:r>
+    </w:p>
+    <w:p>
       <w:pPr>
         <w:pStyle w:val="Heading2"/>
       </w:pPr>
@@ -459,6 +464,12 @@
       </w:r>
     </w:p>
     <w:p>
+      <w:pPr/>
+      <w:r>
+        <w:t>A later section of the same speed script, “Sessions with enough high-speed non-play (raw log power, electrode 1)”, prints which sessions still have non-play at high locomotion speed. Delta and theta peak frequency against speed is task 1.15.</w:t>
+      </w:r>
+    </w:p>
+    <w:p>
       <w:pPr>
         <w:pStyle w:val="Heading2"/>
       </w:pPr>
@@ -522,7 +533,7 @@
           <w:b w:val="0"/>
           <w:sz w:val="22"/>
         </w:rPr>
-        <w:t>Run CSD analysis/Estimate_delta_peak_trough_csd.m before those plots. That export does not re-reference.</w:t>
+        <w:t>Run CSD analysis/Estimate_delta_peak_trough_csd.m before those plots. That export does not re-reference. The within-animal pool of the same peak and trough maps is task 1.17.</w:t>
       </w:r>
     </w:p>
     <w:p>
@@ -1019,7 +1030,7 @@
           <w:b w:val="0"/>
           <w:sz w:val="22"/>
         </w:rPr>
-        <w:t>This shows whether a laminar pattern repeats across sessions. It does not test the neuron phase-gradient point in task 2.5.</w:t>
+        <w:t>This shows whether a laminar pattern repeats across sessions. The neuron phase-gradient figures are task 1.13.</w:t>
       </w:r>
     </w:p>
     <w:p>
@@ -1170,6 +1181,332 @@
     </w:p>
     <w:p>
       <w:pPr>
+        <w:pStyle w:val="Heading2"/>
+      </w:pPr>
+      <w:r>
+        <w:t>1.13 Delta phase versus distance from mid-LPAG, and mid-LPAG-centered neuron phase (Reviewer 2.3)</w:t>
+      </w:r>
+    </w:p>
+    <w:p>
+      <w:pPr/>
+      <w:r>
+        <w:t>Figure script: Figure 2/Supporting codes v2/Analyze_coherence_maps.m. The y-axis is delta phase lag against the LPAG-center channel (mean_phaseLag_freq1, 1–5 Hz).</w:t>
+      </w:r>
+    </w:p>
+    <w:p>
+      <w:pPr>
+        <w:pStyle w:val="ListBullet"/>
+      </w:pPr>
+      <w:r>
+        <w:t>Section “Plot 1 — all sessions”. One line per session. Distance from the LPAG center on x, delta phase difference on y.</w:t>
+      </w:r>
+    </w:p>
+    <w:p>
+      <w:pPr>
+        <w:pStyle w:val="ListBullet"/>
+      </w:pPr>
+      <w:r>
+        <w:t>Section “Plot 2 — one figure per animal, sessions pooled, region borders”.</w:t>
+      </w:r>
+    </w:p>
+    <w:p>
+      <w:pPr>
+        <w:pStyle w:val="ListBullet"/>
+      </w:pPr>
+      <w:r>
+        <w:t>After “Split probes that have DR or OcNuc (often inverted SupCol) from the rest”: a scatter and a 95% confidence interval for probes without DR or OcNuc, and the same figure for probes that have them.</w:t>
+      </w:r>
+    </w:p>
+    <w:p>
+      <w:pPr/>
+      <w:r>
+        <w:t>Figure script: Figure 2/Supporting codes v2/Analyze_coherence_maps_lpag_ref.m. Same distance curves, from the mid-LPAG-only estimate.</w:t>
+      </w:r>
+    </w:p>
+    <w:p>
+      <w:pPr>
+        <w:pStyle w:val="ListBullet"/>
+      </w:pPr>
+      <w:r>
+        <w:t>Section “Plot 1 — all sessions”.</w:t>
+      </w:r>
+    </w:p>
+    <w:p>
+      <w:pPr>
+        <w:pStyle w:val="ListBullet"/>
+      </w:pPr>
+      <w:r>
+        <w:t>Section “Plot 2 — one figure per animal, sessions pooled, region borders”.</w:t>
+      </w:r>
+    </w:p>
+    <w:p>
+      <w:pPr/>
+      <w:r>
+        <w:t>Run Estimate_coherence_maps.m before the pairwise figure, or Estimate_coherence_maps_lpag_ref.m before the mid-LPAG-only figure.</w:t>
+      </w:r>
+    </w:p>
+    <w:p>
+      <w:pPr/>
+      <w:r>
+        <w:t>Neuron preferred phase, re-referenced by subtracting that same mid-LPAG phase lag. Figure script: Figure 3/Figure 3a-e.m. Set lpag_phase_lag_band to delta.</w:t>
+      </w:r>
+    </w:p>
+    <w:p>
+      <w:pPr>
+        <w:pStyle w:val="ListBullet"/>
+      </w:pPr>
+      <w:r>
+        <w:t>Section 18, “LPAG-centered preferred phase”.</w:t>
+      </w:r>
+    </w:p>
+    <w:p>
+      <w:pPr>
+        <w:pStyle w:val="ListBullet"/>
+      </w:pPr>
+      <w:r>
+        <w:t>Section 18a, “Phase distribution, channel-centered and mid-LPAG-centered”.</w:t>
+      </w:r>
+    </w:p>
+    <w:p>
+      <w:pPr>
+        <w:pStyle w:val="ListBullet"/>
+      </w:pPr>
+      <w:r>
+        <w:t>Section 18b, “Two-component mixture on the mid-LPAG-centered angles”.</w:t>
+      </w:r>
+    </w:p>
+    <w:p>
+      <w:pPr>
+        <w:pStyle w:val="ListBullet"/>
+      </w:pPr>
+      <w:r>
+        <w:t>Section 18c, “Mean mid-LPAG-centered angle of trough neurons, per structure”.</w:t>
+      </w:r>
+    </w:p>
+    <w:p>
+      <w:pPr>
+        <w:pStyle w:val="ListBullet"/>
+      </w:pPr>
+      <w:r>
+        <w:t>Section 18d, “Trough / peak / unlocked percentages from the mid-LPAG-centered angles”.</w:t>
+      </w:r>
+    </w:p>
+    <w:p>
+      <w:pPr>
+        <w:pStyle w:val="ListBullet"/>
+      </w:pPr>
+      <w:r>
+        <w:t>Section 18e, “Neurons that stayed trough or stayed peak after the re-reference”.</w:t>
+      </w:r>
+    </w:p>
+    <w:p>
+      <w:pPr>
+        <w:pStyle w:val="Heading2"/>
+      </w:pPr>
+      <w:r>
+        <w:t>1.14 Periodic and aperiodic spectra on every probe channel (Reviewer 2.3)</w:t>
+      </w:r>
+    </w:p>
+    <w:p>
+      <w:pPr/>
+      <w:r>
+        <w:t>Figure script: Figure 2/Supporting codes v2/Analyse_play_session_probe_spectra.m</w:t>
+      </w:r>
+    </w:p>
+    <w:p>
+      <w:pPr>
+        <w:pStyle w:val="ListBullet"/>
+      </w:pPr>
+      <w:r>
+        <w:t>Section “Plot each requested session on its own”. Full spectrum at every channel, with area borders.</w:t>
+      </w:r>
+    </w:p>
+    <w:p>
+      <w:pPr>
+        <w:pStyle w:val="ListBullet"/>
+      </w:pPr>
+      <w:r>
+        <w:t>Section “Stack every selected shank at its mid-LPAG channel”.</w:t>
+      </w:r>
+    </w:p>
+    <w:p>
+      <w:pPr>
+        <w:pStyle w:val="ListBullet"/>
+      </w:pPr>
+      <w:r>
+        <w:t>One pooled spectrogram per animal. The aperiodic fit is removed, and so are the periodic windows in periodic_ranges_to_subtract. The default windows are 6–12 Hz and 0.1–1 Hz. Each shank is its own figure.</w:t>
+      </w:r>
+    </w:p>
+    <w:p>
+      <w:pPr>
+        <w:pStyle w:val="ListBullet"/>
+      </w:pPr>
+      <w:r>
+        <w:t>Region spectra. At each frequency the model is Power ~ 1 + (1|Session) + (1|Session:Channel).</w:t>
+      </w:r>
+    </w:p>
+    <w:p>
+      <w:pPr>
+        <w:pStyle w:val="ListBullet"/>
+      </w:pPr>
+      <w:r>
+        <w:t>Z-scored band power against distance to mid-LPAG, a mixed-model intercept at each distance, and a region comparison with channels nested in the partner session.</w:t>
+      </w:r>
+    </w:p>
+    <w:p>
+      <w:pPr/>
+      <w:r>
+        <w:t>Run Figure 2/Supporting codes v2/Estimate_play_session_probe_spectra.m first. The play-bout onset maps by area remain task 1.1.</w:t>
+      </w:r>
+    </w:p>
+    <w:p>
+      <w:pPr>
+        <w:pStyle w:val="Heading2"/>
+      </w:pPr>
+      <w:r>
+        <w:t>1.15 Delta and theta peak frequency versus speed (Reviewer 2.2)</w:t>
+      </w:r>
+    </w:p>
+    <w:p>
+      <w:pPr/>
+      <w:r>
+        <w:t>Figure script: Figure 2/Supporting codes v2/Analyze_speed_peak_frequency.m</w:t>
+      </w:r>
+    </w:p>
+    <w:p>
+      <w:pPr>
+        <w:pStyle w:val="ListBullet"/>
+      </w:pPr>
+      <w:r>
+        <w:t>Figure “peak frequency vs speed”, for Welch and for Fourier.</w:t>
+      </w:r>
+    </w:p>
+    <w:p>
+      <w:pPr>
+        <w:pStyle w:val="ListBullet"/>
+      </w:pPr>
+      <w:r>
+        <w:t>Figure “within-session correlations”.</w:t>
+      </w:r>
+    </w:p>
+    <w:p>
+      <w:pPr>
+        <w:pStyle w:val="ListBullet"/>
+      </w:pPr>
+      <w:r>
+        <w:t>Figure “Delta and theta correlations”, and the matching log10 p-value histograms.</w:t>
+      </w:r>
+    </w:p>
+    <w:p>
+      <w:pPr>
+        <w:pStyle w:val="ListBullet"/>
+      </w:pPr>
+      <w:r>
+        <w:t>Figure “peak-frequency models”: PeakHz ~ Speed, log(PeakHz) ~ Speed, and PeakHz ~ log(Speed).</w:t>
+      </w:r>
+    </w:p>
+    <w:p>
+      <w:pPr/>
+      <w:r>
+        <w:t>Run Figure 2/Supporting codes v2/Estimate_speed_peak_frequency.m first. Bins are equal-count bins inside each Partners session. The pooled fit is a mixed model with animal and session as repeated measures. The play-minus-non-play power comparison remains task 1.4.</w:t>
+      </w:r>
+    </w:p>
+    <w:p>
+      <w:pPr>
+        <w:pStyle w:val="Heading2"/>
+      </w:pPr>
+      <w:r>
+        <w:t>1.16 Candidate sustained delta episodes in the continuous mid-LPAG signal (Reviewer 2.3)</w:t>
+      </w:r>
+    </w:p>
+    <w:p>
+      <w:pPr/>
+      <w:r>
+        <w:t>Figure script: Figure 2/Supporting codes v2/Analyze_delta_oscillatory_episodes.m</w:t>
+      </w:r>
+    </w:p>
+    <w:p>
+      <w:pPr>
+        <w:pStyle w:val="ListBullet"/>
+      </w:pPr>
+      <w:r>
+        <w:t>Section “One figure per mid-LPAG channel”. Filtered trace, Hilbert amplitude, the detected episode, peaks and troughs, and the cycle-period histogram.</w:t>
+      </w:r>
+    </w:p>
+    <w:p>
+      <w:pPr>
+        <w:pStyle w:val="ListBullet"/>
+      </w:pPr>
+      <w:r>
+        <w:t>Section “Pooled cycle-period histogram”.</w:t>
+      </w:r>
+    </w:p>
+    <w:p>
+      <w:pPr>
+        <w:pStyle w:val="ListBullet"/>
+      </w:pPr>
+      <w:r>
+        <w:t>Section “Session summary”. Duration, cycle count, period variability, and rise–decay symmetry.</w:t>
+      </w:r>
+    </w:p>
+    <w:p>
+      <w:pPr/>
+      <w:r>
+        <w:t>Run Figure 2/Supporting codes v2/Estimate_delta_oscillatory_episodes.m first. These episodes come from the continuous recording. The play-onset average is a different figure.</w:t>
+      </w:r>
+    </w:p>
+    <w:p>
+      <w:pPr>
+        <w:pStyle w:val="Heading2"/>
+      </w:pPr>
+      <w:r>
+        <w:t>1.17 Within-animal pool of the delta peak and trough current-source density (Reviewer 2.3)</w:t>
+      </w:r>
+    </w:p>
+    <w:p>
+      <w:pPr/>
+      <w:r>
+        <w:t>Figure code: CSD analysis/delta_animal_pooled_kcsd.py, function estimate_animal_pooled_delta_kcsd. Sessions of one implanted animal and one probe are combined before the kCSD fit. Peak and trough stay separate. The mean-across-columns figure marks region borders. The single-session maps remain task 1.5.</w:t>
+      </w:r>
+    </w:p>
+    <w:p>
+      <w:pPr>
+        <w:pStyle w:val="Heading2"/>
+      </w:pPr>
+      <w:r>
+        <w:t>1.18 Pounce versus pounce-with-immobilization from band power (Reviewer 1)</w:t>
+      </w:r>
+    </w:p>
+    <w:p>
+      <w:pPr/>
+      <w:r>
+        <w:t>Figure script: Figure 2/Supporting codes v2/Analyze_behavior_class_from_timewrap_power.m. The default classes are Pounce and PounceI.</w:t>
+      </w:r>
+    </w:p>
+    <w:p>
+      <w:pPr>
+        <w:pStyle w:val="ListBullet"/>
+      </w:pPr>
+      <w:r>
+        <w:t>Section “Plot power and the cross-validated confusion matrix”.</w:t>
+      </w:r>
+    </w:p>
+    <w:p>
+      <w:pPr>
+        <w:pStyle w:val="ListBullet"/>
+      </w:pPr>
+      <w:r>
+        <w:t>Section “Compare confusion outcomes across delta, theta, and gamma”.</w:t>
+      </w:r>
+    </w:p>
+    <w:p>
+      <w:pPr/>
+      <w:r>
+        <w:t>Each event is z-scored to its own pre-onset baseline. Training pools events across sessions and animals and balances the two classes inside each fold. Confusion values are the percent of held-out single events. Run Figure 2/Supporting codes v2/Estimate_psth_all_behaviors_theta_gamma.m first. The spike decoder remains task 3.3.</w:t>
+      </w:r>
+    </w:p>
+    <w:p>
+      <w:pPr>
         <w:pStyle w:val="Heading1"/>
       </w:pPr>
       <w:r>
@@ -1327,7 +1664,7 @@
           <w:b w:val="0"/>
           <w:sz w:val="22"/>
         </w:rPr>
-        <w:t>No script draws a locally re-referenced local-field potential. The current-source density figures in tasks 1.5 and 1.9, and the phase-lag figure in task 2.5, are the plots that can stand in that reply.</w:t>
+        <w:t>No script draws a locally re-referenced local-field potential. The current-source density figures in tasks 1.5, 1.9, and 1.17, and the mid-LPAG phase reference in task 1.13, are the plots that can stand in that reply.</w:t>
       </w:r>
     </w:p>
     <w:p>
@@ -1339,144 +1676,13 @@
           <w:rFonts w:ascii="Calibri" w:hAnsi="Calibri"/>
           <w:sz w:val="26"/>
         </w:rPr>
-        <w:t>2.5 Dorsoventral lock gradient versus a volume-conducted phase shift (Reviewer 2.3)</w:t>
+        <w:t>2.5 Dorsoventral lock gradient (Reviewer 2.3) — figures are now tasks 1.13 and 1.14</w:t>
       </w:r>
     </w:p>
     <w:p>
-      <w:pPr>
-        <w:spacing w:after="120" w:before="0" w:line="240" w:lineRule="auto"/>
-      </w:pPr>
+      <w:pPr/>
       <w:r>
-        <w:rPr>
-          <w:rFonts w:ascii="Calibri" w:hAnsi="Calibri"/>
-          <w:b w:val="0"/>
-          <w:sz w:val="22"/>
-        </w:rPr>
-        <w:t>Phase-lag figure you are drawing:</w:t>
-      </w:r>
-    </w:p>
-    <w:p>
-      <w:pPr>
-        <w:pStyle w:val="ListBullet"/>
-        <w:spacing w:after="40" w:before="0"/>
-      </w:pPr>
-      <w:r>
-        <w:rPr>
-          <w:rFonts w:ascii="Calibri" w:hAnsi="Calibri"/>
-          <w:b w:val="0"/>
-          <w:sz w:val="22"/>
-        </w:rPr>
-        <w:t>Figure 2/Supporting codes v2/Estimate_coherence_maps.m, section “Plot — phase lags”. Channel-by-channel phase-lag matrix, depth on both axes. As written it uses mean_phaseLag_freq2 (6–12 Hz). Delta is mean_phaseLag_freq1.</w:t>
-      </w:r>
-    </w:p>
-    <w:p>
-      <w:pPr>
-        <w:spacing w:after="120" w:before="0" w:line="240" w:lineRule="auto"/>
-      </w:pPr>
-      <w:r>
-        <w:rPr>
-          <w:rFonts w:ascii="Calibri" w:hAnsi="Calibri"/>
-          <w:b w:val="0"/>
-          <w:sz w:val="22"/>
-        </w:rPr>
-        <w:t>The gradient the reviewer is questioning:</w:t>
-      </w:r>
-    </w:p>
-    <w:p>
-      <w:pPr>
-        <w:pStyle w:val="ListBullet"/>
-        <w:spacing w:after="40" w:before="0"/>
-      </w:pPr>
-      <w:r>
-        <w:rPr>
-          <w:rFonts w:ascii="Calibri" w:hAnsi="Calibri"/>
-          <w:b w:val="0"/>
-          <w:sz w:val="22"/>
-        </w:rPr>
-        <w:t>Figure 3/Figure 3a-e.m, section 13, “Fig 3d Percent per area” (trough-locked versus peak-locked fractions).</w:t>
-      </w:r>
-    </w:p>
-    <w:p>
-      <w:pPr>
-        <w:pStyle w:val="ListBullet"/>
-        <w:spacing w:after="40" w:before="0"/>
-      </w:pPr>
-      <w:r>
-        <w:rPr>
-          <w:rFonts w:ascii="Calibri" w:hAnsi="Calibri"/>
-          <w:b w:val="0"/>
-          <w:sz w:val="22"/>
-        </w:rPr>
-        <w:t>Figure 3/Figure 3a-e.m, section 11, “Plot mean preferred angle per structure”.</w:t>
-      </w:r>
-    </w:p>
-    <w:p>
-      <w:pPr>
-        <w:spacing w:after="120" w:before="0" w:line="240" w:lineRule="auto"/>
-      </w:pPr>
-      <w:r>
-        <w:rPr>
-          <w:rFonts w:ascii="Calibri" w:hAnsi="Calibri"/>
-          <w:b w:val="0"/>
-          <w:sz w:val="22"/>
-        </w:rPr>
-        <w:t>Depth-resolved field figures that belong with the same answer:</w:t>
-      </w:r>
-    </w:p>
-    <w:p>
-      <w:pPr>
-        <w:pStyle w:val="ListBullet"/>
-        <w:spacing w:after="40" w:before="0"/>
-      </w:pPr>
-      <w:r>
-        <w:rPr>
-          <w:rFonts w:ascii="Calibri" w:hAnsi="Calibri"/>
-          <w:b w:val="0"/>
-          <w:sz w:val="22"/>
-        </w:rPr>
-        <w:t>CSD analysis/Plot_delta_peak_trough_evoked.m. Amplitude versus depth.</w:t>
-      </w:r>
-    </w:p>
-    <w:p>
-      <w:pPr>
-        <w:pStyle w:val="ListBullet"/>
-        <w:spacing w:after="40" w:before="0"/>
-      </w:pPr>
-      <w:r>
-        <w:rPr>
-          <w:rFonts w:ascii="Calibri" w:hAnsi="Calibri"/>
-          <w:b w:val="0"/>
-          <w:sz w:val="22"/>
-        </w:rPr>
-        <w:t>CSD analysis/csd_1d_pipeline.py, run_delta_csd_from_root, and CSD_1D_general.ipynb. Peak and trough current-source density.</w:t>
-      </w:r>
-    </w:p>
-    <w:p>
-      <w:pPr>
-        <w:pStyle w:val="ListBullet"/>
-        <w:spacing w:after="40" w:before="0"/>
-      </w:pPr>
-      <w:r>
-        <w:rPr>
-          <w:rFonts w:ascii="Calibri" w:hAnsi="Calibri"/>
-          <w:b w:val="0"/>
-          <w:sz w:val="22"/>
-        </w:rPr>
-        <w:t>CSD analysis/area_csd_consistency.py. mean_csd.png, sign_consistency.png, smoothed_mean_clusters.png (task 1.10).</w:t>
-      </w:r>
-    </w:p>
-    <w:p>
-      <w:pPr>
-        <w:pStyle w:val="ListBullet"/>
-        <w:spacing w:after="40" w:before="0"/>
-      </w:pPr>
-      <w:r>
-        <w:rPr>
-          <w:rFonts w:ascii="Calibri" w:hAnsi="Calibri"/>
-          <w:b w:val="0"/>
-          <w:sz w:val="22"/>
-        </w:rPr>
-        <w:t>Per-area onset PSTHs and power maps are in task 1.1: Figure 2/Supporting codes v2/Analyze_psth_area_maps.m.</w:t>
+        <w:t>Figure code for this point is in the repository. Delta phase versus distance from mid-LPAG, and the mid-LPAG-centered neuron angles, are task 1.13. Channel-wise periodic and aperiodic spectra along the probe are task 1.14.</w:t>
       </w:r>
     </w:p>
     <w:p>
@@ -1556,7 +1762,7 @@
           <w:b w:val="0"/>
           <w:sz w:val="22"/>
         </w:rPr>
-        <w:t>These compare partner 1 with partner 2. None of them separates partner identity from session order.</w:t>
+        <w:t>These compare partner 1 with partner 2. The mixed model behind section 6 is Figure 2/Supporting codes v2/Estimate_psth_play_bout_lme.m. At each time bin it is Power ~ 1 + Partner + (1|Session), and results.partner_est is Partner2 minus Partner1. Partner identity follows the Behavior block that contains the bout. That label still follows the order of partners inside the recording day.</w:t>
       </w:r>
     </w:p>
     <w:p>
@@ -1636,7 +1842,7 @@
           <w:b w:val="0"/>
           <w:sz w:val="22"/>
         </w:rPr>
-        <w:t>The neural decoder, false alarms, and split-half ceiling are listed under the collaborator (task 3.6). Gamma in both animals is task 3.5.</w:t>
+        <w:t>The band-power classifier for Pounce versus PounceI is task 1.18. The spike decoder, false alarms, and split-half ceiling remain with the collaborator (task 3.3). Gamma in both animals is task 3.4.</w:t>
       </w:r>
     </w:p>
     <w:p>
@@ -1748,6 +1954,20 @@
       </w:r>
     </w:p>
     <w:p>
+      <w:pPr/>
+      <w:r>
+        <w:t>Theta and gamma use the same alignments. Figure script: Figure 2/Supporting codes v2/Analyze_psth_all_behaviors_theta_gamma.m. The plot sections match the delta script, including “Plot colormap and mean responses (play vs non-play)”, “Plot self vs other — play behaviors”, and the time-wrapped sections.</w:t>
+      </w:r>
+    </w:p>
+    <w:p>
+      <w:pPr>
+        <w:pStyle w:val="ListBullet"/>
+      </w:pPr>
+      <w:r>
+        <w:t>Section “Pre-onset spectrum of the onset-aligned power”. FOOOF periodic part of the spectrum from −5 s to onset, for each behavior, self and other. Run Estimate_psth_all_behaviors_theta_gamma.m before that figure.</w:t>
+      </w:r>
+    </w:p>
+    <w:p>
       <w:pPr>
         <w:pStyle w:val="Heading2"/>
       </w:pPr>
@@ -1769,7 +1989,7 @@
           <w:b w:val="0"/>
           <w:sz w:val="22"/>
         </w:rPr>
-        <w:t>No distance-matched figure. The speed-matched figure is task 1.4. manual traking/manual_traking.m can supply positions later. It does not draw this comparison.</w:t>
+        <w:t>No distance-matched play versus non-play figure. Task 1.4 prints which sessions have non-play at high speed, in “Sessions with enough high-speed non-play”. When that speed file is current, RelativeSpeed is the within-session change in inter-animal distance. manual traking/manual_traking.m can supply positions later.</w:t>
       </w:r>
     </w:p>
     <w:p>
@@ -1881,6 +2101,12 @@
       </w:r>
     </w:p>
     <w:p>
+      <w:pPr/>
+      <w:r>
+        <w:t>The probe spectra in task 1.14 nest channels inside sessions. Figure 3 section 18 re-references angles to mid-LPAG. The original pooled panels listed above are still those unrevised tests.</w:t>
+      </w:r>
+    </w:p>
+    <w:p>
       <w:pPr>
         <w:pStyle w:val="Heading2"/>
       </w:pPr>
@@ -1936,6 +2162,14 @@
     </w:p>
     <w:p>
       <w:pPr>
+        <w:pStyle w:val="ListBullet"/>
+      </w:pPr>
+      <w:r>
+        <w:t>Figure 2/Supporting codes v2/Estimate percentage of R2.m, section “ESTIMATE R2 contribution of each variable”. Thirty-fold cross-validated partial R², with animal as a random effect. The full-model R² is printed together with each predictor’s unique contribution.</w:t>
+      </w:r>
+    </w:p>
+    <w:p>
+      <w:pPr>
         <w:pStyle w:val="Heading1"/>
       </w:pPr>
       <w:r>
@@ -2288,7 +2522,7 @@
           <w:b w:val="0"/>
           <w:sz w:val="22"/>
         </w:rPr>
-        <w:t>Channel phase-lag index and weighted phase-lag index, a different measure: Figure 2/Supporting codes v2/Compute_pli_wpli.m and Compute_pli_wpli_segments.m, plotted from Estimate_coherence_maps.m.</w:t>
+        <w:t>Channel phase lag versus distance from mid-LPAG, a different measure from neuron–field PPC: Figure 2/Supporting codes v2/Analyze_coherence_maps.m and Analyze_coherence_maps_lpag_ref.m (task 1.13). PLI and wPLI are computed in Compute_pli_wpli.m and Compute_pli_wpli_segments.m.</w:t>
       </w:r>
     </w:p>
     <w:p>

</xml_diff>